<commit_message>
CV: add GitHub and portfolio links, FEXIWALT, rename dealership to Agoloso Motors
Co-Authored-By: Claude Opus 5.5 <noreply@anthropic.com>
Claude-Session: https://claude.ai/code/session_01K2tEPmJeWemg97ZUaf8CVA
</commit_message>
<xml_diff>
--- a/cv/Bright_Akwasi_Kodua_CV_LMI_Holdings.docx
+++ b/cv/Bright_Akwasi_Kodua_CV_LMI_Holdings.docx
@@ -52,6 +52,45 @@
         </w:rPr>
         <w:t xml:space="preserve">Accra, Ghana   |   +233 535 862 985   |   brightkoduaakwasi@gmail.com</w:t>
       </w:r>
+    </w:p>
+    <w:p>
+      <w:pPr>
+        <w:spacing w:after="80"/>
+        <w:jc w:val="center"/>
+      </w:pPr>
+      <w:hyperlink w:history="1" r:id="rId90uf6vcf1yqkmbpqpo4a0">
+        <w:r>
+          <w:rPr>
+            <w:rFonts w:ascii="Calibri" w:cs="Calibri" w:eastAsia="Calibri" w:hAnsi="Calibri"/>
+            <w:color w:val="B3121B"/>
+            <w:sz w:val="19"/>
+            <w:szCs w:val="19"/>
+            <w:u w:val="single"/>
+          </w:rPr>
+          <w:t xml:space="preserve">github.com/KODUAAA</w:t>
+        </w:r>
+      </w:hyperlink>
+      <w:r>
+        <w:rPr>
+          <w:rFonts w:ascii="Calibri" w:cs="Calibri" w:eastAsia="Calibri" w:hAnsi="Calibri"/>
+          <w:color w:val="595959"/>
+          <w:sz w:val="19"/>
+          <w:szCs w:val="19"/>
+        </w:rPr>
+        <w:t xml:space="preserve">   |   </w:t>
+      </w:r>
+      <w:hyperlink w:history="1" r:id="rIdf-mlo-lrie7c8gsf9eavv">
+        <w:r>
+          <w:rPr>
+            <w:rFonts w:ascii="Calibri" w:cs="Calibri" w:eastAsia="Calibri" w:hAnsi="Calibri"/>
+            <w:color w:val="B3121B"/>
+            <w:sz w:val="19"/>
+            <w:szCs w:val="19"/>
+            <w:u w:val="single"/>
+          </w:rPr>
+          <w:t xml:space="preserve">koduaaa.github.io</w:t>
+        </w:r>
+      </w:hyperlink>
     </w:p>
     <w:p>
       <w:pPr>
@@ -414,7 +453,7 @@
                 <w:sz w:val="20"/>
                 <w:szCs w:val="20"/>
               </w:rPr>
-              <w:t xml:space="preserve">React, Express, Flask</w:t>
+              <w:t xml:space="preserve">React, Express, Flask, Firebase, PWAs</w:t>
             </w:r>
           </w:p>
           <w:p>
@@ -593,7 +632,7 @@
           <w:sz w:val="21"/>
           <w:szCs w:val="21"/>
         </w:rPr>
-        <w:t xml:space="preserve">Phishing URL Detection System</w:t>
+        <w:t xml:space="preserve">FEXIWALT: Ecommerce &amp; Classifieds Marketplace</w:t>
       </w:r>
       <w:r>
         <w:rPr>
@@ -604,7 +643,7 @@
           <w:sz w:val="19"/>
           <w:szCs w:val="19"/>
         </w:rPr>
-        <w:t xml:space="preserve">	Flask, Machine Learning</w:t>
+        <w:t xml:space="preserve">	JavaScript, Firebase, PWA</w:t>
       </w:r>
     </w:p>
     <w:p>
@@ -620,8 +659,20 @@
           <w:sz w:val="19"/>
           <w:szCs w:val="19"/>
         </w:rPr>
-        <w:t xml:space="preserve">Final-Year Dissertation Project</w:t>
-      </w:r>
+        <w:t xml:space="preserve">Live at </w:t>
+      </w:r>
+      <w:hyperlink w:history="1" r:id="rIdhxu5qiqwa5r_xe80njh85">
+        <w:r>
+          <w:rPr>
+            <w:rFonts w:ascii="Calibri" w:cs="Calibri" w:eastAsia="Calibri" w:hAnsi="Calibri"/>
+            <w:color w:val="B3121B"/>
+            <w:sz w:val="19"/>
+            <w:szCs w:val="19"/>
+            <w:u w:val="single"/>
+          </w:rPr>
+          <w:t xml:space="preserve">fexiwalt.com</w:t>
+        </w:r>
+      </w:hyperlink>
     </w:p>
     <w:p>
       <w:pPr>
@@ -639,7 +690,7 @@
           <w:sz w:val="20"/>
           <w:szCs w:val="20"/>
         </w:rPr>
-        <w:t xml:space="preserve">Developing a machine-learning system that detects phishing URLs in real time, applying AI to a practical security problem.</w:t>
+        <w:t xml:space="preserve">Built and deployed a live marketplace for Ghana where people buy and sell phones, vehicles, property, fashion and more.</w:t>
       </w:r>
     </w:p>
     <w:p>
@@ -658,7 +709,7 @@
           <w:sz w:val="20"/>
           <w:szCs w:val="20"/>
         </w:rPr>
-        <w:t xml:space="preserve">Covers data collection, feature engineering, model training and evaluation, and deployment through a Flask web interface.</w:t>
+        <w:t xml:space="preserve">Mobile-first, installable web app with offline support, category browsing, search and WhatsApp-based buyer-seller contact.</w:t>
       </w:r>
     </w:p>
     <w:p>
@@ -677,7 +728,7 @@
           <w:sz w:val="21"/>
           <w:szCs w:val="21"/>
         </w:rPr>
-        <w:t xml:space="preserve">Lamont Motors: Full-Stack Web Application</w:t>
+        <w:t xml:space="preserve">Phishing URL Detection System</w:t>
       </w:r>
       <w:r>
         <w:rPr>
@@ -688,7 +739,23 @@
           <w:sz w:val="19"/>
           <w:szCs w:val="19"/>
         </w:rPr>
-        <w:t xml:space="preserve">	Node.js, Express, React, PostgreSQL, Supabase</w:t>
+        <w:t xml:space="preserve">	Flask, Machine Learning</w:t>
+      </w:r>
+    </w:p>
+    <w:p>
+      <w:pPr>
+        <w:spacing w:after="40"/>
+      </w:pPr>
+      <w:r>
+        <w:rPr>
+          <w:rFonts w:ascii="Calibri" w:cs="Calibri" w:eastAsia="Calibri" w:hAnsi="Calibri"/>
+          <w:i/>
+          <w:iCs/>
+          <w:color w:val="595959"/>
+          <w:sz w:val="19"/>
+          <w:szCs w:val="19"/>
+        </w:rPr>
+        <w:t xml:space="preserve">Final-Year Dissertation Project</w:t>
       </w:r>
     </w:p>
     <w:p>
@@ -707,7 +774,7 @@
           <w:sz w:val="20"/>
           <w:szCs w:val="20"/>
         </w:rPr>
-        <w:t xml:space="preserve">Built and deployed a complete car-dealership platform end-to-end as the sole developer.</w:t>
+        <w:t xml:space="preserve">Developing a machine-learning system that detects phishing URLs in real time, applying AI to a practical security problem.</w:t>
       </w:r>
     </w:p>
     <w:p>
@@ -726,7 +793,103 @@
           <w:sz w:val="20"/>
           <w:szCs w:val="20"/>
         </w:rPr>
-        <w:t xml:space="preserve">Independently handled backend setup, environment configuration, and database migration to Supabase/PostgreSQL.</w:t>
+        <w:t xml:space="preserve">Covers data collection, feature engineering, model training and evaluation, and deployment through a Flask web interface.</w:t>
+      </w:r>
+    </w:p>
+    <w:p>
+      <w:pPr>
+        <w:tabs>
+          <w:tab w:val="right" w:pos="10206"/>
+        </w:tabs>
+        <w:spacing w:after="30" w:before="100"/>
+      </w:pPr>
+      <w:r>
+        <w:rPr>
+          <w:rFonts w:ascii="Calibri" w:cs="Calibri" w:eastAsia="Calibri" w:hAnsi="Calibri"/>
+          <w:b/>
+          <w:bCs/>
+          <w:color w:val="222222"/>
+          <w:sz w:val="21"/>
+          <w:szCs w:val="21"/>
+        </w:rPr>
+        <w:t xml:space="preserve">Agoloso Motors: Car Dealership Platform</w:t>
+      </w:r>
+      <w:r>
+        <w:rPr>
+          <w:rFonts w:ascii="Calibri" w:cs="Calibri" w:eastAsia="Calibri" w:hAnsi="Calibri"/>
+          <w:i/>
+          <w:iCs/>
+          <w:color w:val="595959"/>
+          <w:sz w:val="19"/>
+          <w:szCs w:val="19"/>
+        </w:rPr>
+        <w:t xml:space="preserve">	Node.js, Express, PostgreSQL, Supabase, JWT</w:t>
+      </w:r>
+    </w:p>
+    <w:p>
+      <w:pPr>
+        <w:spacing w:after="40"/>
+      </w:pPr>
+      <w:r>
+        <w:rPr>
+          <w:rFonts w:ascii="Calibri" w:cs="Calibri" w:eastAsia="Calibri" w:hAnsi="Calibri"/>
+          <w:i/>
+          <w:iCs/>
+          <w:color w:val="595959"/>
+          <w:sz w:val="19"/>
+          <w:szCs w:val="19"/>
+        </w:rPr>
+        <w:t xml:space="preserve">Code: </w:t>
+      </w:r>
+      <w:hyperlink w:history="1" r:id="rIdoap8bysk-s-pfaerkzqxj">
+        <w:r>
+          <w:rPr>
+            <w:rFonts w:ascii="Calibri" w:cs="Calibri" w:eastAsia="Calibri" w:hAnsi="Calibri"/>
+            <w:color w:val="B3121B"/>
+            <w:sz w:val="19"/>
+            <w:szCs w:val="19"/>
+            <w:u w:val="single"/>
+          </w:rPr>
+          <w:t xml:space="preserve">github.com/KODUAAA/agoloso-motors</w:t>
+        </w:r>
+      </w:hyperlink>
+    </w:p>
+    <w:p>
+      <w:pPr>
+        <w:pStyle w:val="ListParagraph"/>
+        <w:numPr>
+          <w:ilvl w:val="0"/>
+          <w:numId w:val="2"/>
+        </w:numPr>
+        <w:spacing w:after="40" w:line="252"/>
+      </w:pPr>
+      <w:r>
+        <w:rPr>
+          <w:rFonts w:ascii="Calibri" w:cs="Calibri" w:eastAsia="Calibri" w:hAnsi="Calibri"/>
+          <w:color w:val="222222"/>
+          <w:sz w:val="20"/>
+          <w:szCs w:val="20"/>
+        </w:rPr>
+        <w:t xml:space="preserve">Built and deployed end-to-end as the sole developer: a public site for browsing stock, booking test drives and applying for finance, plus a staff admin dashboard.</w:t>
+      </w:r>
+    </w:p>
+    <w:p>
+      <w:pPr>
+        <w:pStyle w:val="ListParagraph"/>
+        <w:numPr>
+          <w:ilvl w:val="0"/>
+          <w:numId w:val="2"/>
+        </w:numPr>
+        <w:spacing w:after="40" w:line="252"/>
+      </w:pPr>
+      <w:r>
+        <w:rPr>
+          <w:rFonts w:ascii="Calibri" w:cs="Calibri" w:eastAsia="Calibri" w:hAnsi="Calibri"/>
+          <w:color w:val="222222"/>
+          <w:sz w:val="20"/>
+          <w:szCs w:val="20"/>
+        </w:rPr>
+        <w:t xml:space="preserve">Secured with bcrypt password hashing, JWT sessions, role-based access, rate limiting and row-level security; covered by 20 end-to-end API tests.</w:t>
       </w:r>
     </w:p>
     <w:p>

</xml_diff>

<commit_message>
CV: link FEXIWALT source code
Co-Authored-By: Claude Opus 5.5 <noreply@anthropic.com>
Claude-Session: https://claude.ai/code/session_01K2tEPmJeWemg97ZUaf8CVA
</commit_message>
<xml_diff>
--- a/cv/Bright_Akwasi_Kodua_CV_LMI_Holdings.docx
+++ b/cv/Bright_Akwasi_Kodua_CV_LMI_Holdings.docx
@@ -58,7 +58,7 @@
         <w:spacing w:after="80"/>
         <w:jc w:val="center"/>
       </w:pPr>
-      <w:hyperlink w:history="1" r:id="rId90uf6vcf1yqkmbpqpo4a0">
+      <w:hyperlink w:history="1" r:id="rIdlsp9vukrnp7lnj_zqllx-">
         <w:r>
           <w:rPr>
             <w:rFonts w:ascii="Calibri" w:cs="Calibri" w:eastAsia="Calibri" w:hAnsi="Calibri"/>
@@ -79,7 +79,7 @@
         </w:rPr>
         <w:t xml:space="preserve">   |   </w:t>
       </w:r>
-      <w:hyperlink w:history="1" r:id="rIdf-mlo-lrie7c8gsf9eavv">
+      <w:hyperlink w:history="1" r:id="rIdmqfcnyi2tvxdlq9eztzak">
         <w:r>
           <w:rPr>
             <w:rFonts w:ascii="Calibri" w:cs="Calibri" w:eastAsia="Calibri" w:hAnsi="Calibri"/>
@@ -661,7 +661,7 @@
         </w:rPr>
         <w:t xml:space="preserve">Live at </w:t>
       </w:r>
-      <w:hyperlink w:history="1" r:id="rIdhxu5qiqwa5r_xe80njh85">
+      <w:hyperlink w:history="1" r:id="rId98ogtlvru8tkiu4duxcyt">
         <w:r>
           <w:rPr>
             <w:rFonts w:ascii="Calibri" w:cs="Calibri" w:eastAsia="Calibri" w:hAnsi="Calibri"/>
@@ -673,6 +673,29 @@
           <w:t xml:space="preserve">fexiwalt.com</w:t>
         </w:r>
       </w:hyperlink>
+      <w:r>
+        <w:rPr>
+          <w:rFonts w:ascii="Calibri" w:cs="Calibri" w:eastAsia="Calibri" w:hAnsi="Calibri"/>
+          <w:i/>
+          <w:iCs/>
+          <w:color w:val="595959"/>
+          <w:sz w:val="19"/>
+          <w:szCs w:val="19"/>
+        </w:rPr>
+        <w:t xml:space="preserve">   |   Code: </w:t>
+      </w:r>
+      <w:hyperlink w:history="1" r:id="rIdfs2igpwn2485yjcjcdvbt">
+        <w:r>
+          <w:rPr>
+            <w:rFonts w:ascii="Calibri" w:cs="Calibri" w:eastAsia="Calibri" w:hAnsi="Calibri"/>
+            <w:color w:val="B3121B"/>
+            <w:sz w:val="19"/>
+            <w:szCs w:val="19"/>
+            <w:u w:val="single"/>
+          </w:rPr>
+          <w:t xml:space="preserve">github.com/KODUAAA/fexiwalt</w:t>
+        </w:r>
+      </w:hyperlink>
     </w:p>
     <w:p>
       <w:pPr>
@@ -841,7 +864,7 @@
         </w:rPr>
         <w:t xml:space="preserve">Code: </w:t>
       </w:r>
-      <w:hyperlink w:history="1" r:id="rIdoap8bysk-s-pfaerkzqxj">
+      <w:hyperlink w:history="1" r:id="rIdka_l0vinevyriwwz_rbik">
         <w:r>
           <w:rPr>
             <w:rFonts w:ascii="Calibri" w:cs="Calibri" w:eastAsia="Calibri" w:hAnsi="Calibri"/>

</xml_diff>

<commit_message>
CV: add Dream Villa VR project
Co-Authored-By: Claude Opus 5.5 <noreply@anthropic.com>
Claude-Session: https://claude.ai/code/session_01K2tEPmJeWemg97ZUaf8CVA
</commit_message>
<xml_diff>
--- a/cv/Bright_Akwasi_Kodua_CV_LMI_Holdings.docx
+++ b/cv/Bright_Akwasi_Kodua_CV_LMI_Holdings.docx
@@ -58,7 +58,7 @@
         <w:spacing w:after="80"/>
         <w:jc w:val="center"/>
       </w:pPr>
-      <w:hyperlink w:history="1" r:id="rIdlsp9vukrnp7lnj_zqllx-">
+      <w:hyperlink w:history="1" r:id="rIdfdmpf0-hi5prggtraeuo4">
         <w:r>
           <w:rPr>
             <w:rFonts w:ascii="Calibri" w:cs="Calibri" w:eastAsia="Calibri" w:hAnsi="Calibri"/>
@@ -79,7 +79,7 @@
         </w:rPr>
         <w:t xml:space="preserve">   |   </w:t>
       </w:r>
-      <w:hyperlink w:history="1" r:id="rIdmqfcnyi2tvxdlq9eztzak">
+      <w:hyperlink w:history="1" r:id="rIdue-a8cg2-f4kt3eebohzj">
         <w:r>
           <w:rPr>
             <w:rFonts w:ascii="Calibri" w:cs="Calibri" w:eastAsia="Calibri" w:hAnsi="Calibri"/>
@@ -661,7 +661,7 @@
         </w:rPr>
         <w:t xml:space="preserve">Live at </w:t>
       </w:r>
-      <w:hyperlink w:history="1" r:id="rId98ogtlvru8tkiu4duxcyt">
+      <w:hyperlink w:history="1" r:id="rIduiyxuzgq-do5o5ygcojp3">
         <w:r>
           <w:rPr>
             <w:rFonts w:ascii="Calibri" w:cs="Calibri" w:eastAsia="Calibri" w:hAnsi="Calibri"/>
@@ -684,7 +684,7 @@
         </w:rPr>
         <w:t xml:space="preserve">   |   Code: </w:t>
       </w:r>
-      <w:hyperlink w:history="1" r:id="rIdfs2igpwn2485yjcjcdvbt">
+      <w:hyperlink w:history="1" r:id="rIdpnlzgrvio5_yr6iph8hbv">
         <w:r>
           <w:rPr>
             <w:rFonts w:ascii="Calibri" w:cs="Calibri" w:eastAsia="Calibri" w:hAnsi="Calibri"/>
@@ -864,7 +864,7 @@
         </w:rPr>
         <w:t xml:space="preserve">Code: </w:t>
       </w:r>
-      <w:hyperlink w:history="1" r:id="rIdka_l0vinevyriwwz_rbik">
+      <w:hyperlink w:history="1" r:id="rIdmmffcxtrp-lpy2otyxrfx">
         <w:r>
           <w:rPr>
             <w:rFonts w:ascii="Calibri" w:cs="Calibri" w:eastAsia="Calibri" w:hAnsi="Calibri"/>
@@ -962,6 +962,83 @@
           <w:szCs w:val="20"/>
         </w:rPr>
         <w:t xml:space="preserve">Designed a full network security architecture for a fintech scenario, covering VLAN segmentation, IPsec VPN, and WPA3 wireless security.</w:t>
+      </w:r>
+    </w:p>
+    <w:p>
+      <w:pPr>
+        <w:tabs>
+          <w:tab w:val="right" w:pos="10206"/>
+        </w:tabs>
+        <w:spacing w:after="30" w:before="100"/>
+      </w:pPr>
+      <w:r>
+        <w:rPr>
+          <w:rFonts w:ascii="Calibri" w:cs="Calibri" w:eastAsia="Calibri" w:hAnsi="Calibri"/>
+          <w:b/>
+          <w:bCs/>
+          <w:color w:val="222222"/>
+          <w:sz w:val="21"/>
+          <w:szCs w:val="21"/>
+        </w:rPr>
+        <w:t xml:space="preserve">Dream Villa VR: 3D Web Experience</w:t>
+      </w:r>
+      <w:r>
+        <w:rPr>
+          <w:rFonts w:ascii="Calibri" w:cs="Calibri" w:eastAsia="Calibri" w:hAnsi="Calibri"/>
+          <w:i/>
+          <w:iCs/>
+          <w:color w:val="595959"/>
+          <w:sz w:val="19"/>
+          <w:szCs w:val="19"/>
+        </w:rPr>
+        <w:t xml:space="preserve">	A-Frame, WebXR, JavaScript</w:t>
+      </w:r>
+    </w:p>
+    <w:p>
+      <w:pPr>
+        <w:spacing w:after="40"/>
+      </w:pPr>
+      <w:r>
+        <w:rPr>
+          <w:rFonts w:ascii="Calibri" w:cs="Calibri" w:eastAsia="Calibri" w:hAnsi="Calibri"/>
+          <w:i/>
+          <w:iCs/>
+          <w:color w:val="595959"/>
+          <w:sz w:val="19"/>
+          <w:szCs w:val="19"/>
+        </w:rPr>
+        <w:t xml:space="preserve">Live at </w:t>
+      </w:r>
+      <w:hyperlink w:history="1" r:id="rIdpls-ypjvynnedggbs1e8y">
+        <w:r>
+          <w:rPr>
+            <w:rFonts w:ascii="Calibri" w:cs="Calibri" w:eastAsia="Calibri" w:hAnsi="Calibri"/>
+            <w:color w:val="B3121B"/>
+            <w:sz w:val="19"/>
+            <w:szCs w:val="19"/>
+            <w:u w:val="single"/>
+          </w:rPr>
+          <w:t xml:space="preserve">pscsc220024.vercel.app</w:t>
+        </w:r>
+      </w:hyperlink>
+    </w:p>
+    <w:p>
+      <w:pPr>
+        <w:pStyle w:val="ListParagraph"/>
+        <w:numPr>
+          <w:ilvl w:val="0"/>
+          <w:numId w:val="2"/>
+        </w:numPr>
+        <w:spacing w:after="40" w:line="252"/>
+      </w:pPr>
+      <w:r>
+        <w:rPr>
+          <w:rFonts w:ascii="Calibri" w:cs="Calibri" w:eastAsia="Calibri" w:hAnsi="Calibri"/>
+          <w:color w:val="222222"/>
+          <w:sz w:val="20"/>
+          <w:szCs w:val="20"/>
+        </w:rPr>
+        <w:t xml:space="preserve">Built a browser-based 3D walkthrough of a furnished villa with animated characters and water, optimising models and textures for fast loading.</w:t>
       </w:r>
     </w:p>
     <w:p>

</xml_diff>